<commit_message>
feat: align MVP with requirements v1.1
</commit_message>
<xml_diff>
--- a/docs/source/TZ_EventHub_UZ_Prilozhenie1.docx
+++ b/docs/source/TZ_EventHub_UZ_Prilozhenie1.docx
@@ -77,7 +77,7 @@
           <w:sz w:val="20"/>
           <w:szCs w:val="20"/>
         </w:rPr>
-        <w:t xml:space="preserve">Версия документа: 1.0</w:t>
+        <w:t xml:space="preserve">Версия документа: 1.1</w:t>
       </w:r>
     </w:p>
     <w:p>
@@ -1875,6 +1875,19 @@
     </w:p>
     <w:p>
       <w:pPr>
+        <w:spacing w:after="160"/>
+      </w:pPr>
+      <w:r>
+        <w:rPr>
+          <w:i/>
+          <w:iCs/>
+          <w:color w:val="555555"/>
+        </w:rPr>
+        <w:t xml:space="preserve">Языки заполнения карточки: на старте платформа работает на двух языках — узбекском и русском. Все текстовые поля (название, короткое и полное описание) поставщик заполняет на обоих языках; английский язык интерфейса и карточек добавляется на последующем этапе.</w:t>
+      </w:r>
+    </w:p>
+    <w:p>
+      <w:pPr>
         <w:pStyle w:val="Heading3"/>
         <w:spacing w:after="100" w:before="220"/>
       </w:pPr>
@@ -2379,7 +2392,7 @@
                 <w:sz w:val="19"/>
                 <w:szCs w:val="19"/>
               </w:rPr>
-              <w:t xml:space="preserve">До 3, каждая — со своим набором атрибутов</w:t>
+              <w:t xml:space="preserve">До 3, каждая — со своим набором атрибутов; размещение во всех категориях бесплатное</w:t>
             </w:r>
           </w:p>
         </w:tc>
@@ -3127,7 +3140,7 @@
                 <w:sz w:val="19"/>
                 <w:szCs w:val="19"/>
               </w:rPr>
-              <w:t xml:space="preserve">Текст</w:t>
+              <w:t xml:space="preserve">Текст (UZ + RU)</w:t>
             </w:r>
           </w:p>
         </w:tc>
@@ -3165,7 +3178,7 @@
                 <w:sz w:val="19"/>
                 <w:szCs w:val="19"/>
               </w:rPr>
-              <w:t xml:space="preserve">До 120 символов, показывается в карточке списка</w:t>
+              <w:t xml:space="preserve">До 120 символов на каждом языке, показывается в карточке списка</w:t>
             </w:r>
           </w:p>
         </w:tc>
@@ -3207,7 +3220,7 @@
                 <w:sz w:val="19"/>
                 <w:szCs w:val="19"/>
               </w:rPr>
-              <w:t xml:space="preserve">Текст (форматированный)</w:t>
+              <w:t xml:space="preserve">Текст (UZ + RU)</w:t>
             </w:r>
           </w:p>
         </w:tc>
@@ -3247,7 +3260,7 @@
                 <w:sz w:val="19"/>
                 <w:szCs w:val="19"/>
               </w:rPr>
-              <w:t xml:space="preserve">До 1500 символов</w:t>
+              <w:t xml:space="preserve">До 1500 символов на каждом языке</w:t>
             </w:r>
           </w:p>
         </w:tc>
@@ -8420,7 +8433,7 @@
                 <w:sz w:val="19"/>
                 <w:szCs w:val="19"/>
               </w:rPr>
-              <w:t xml:space="preserve">Живое выступление, от 1 минуты, давностью не более 2 лет</w:t>
+              <w:t xml:space="preserve">Живое выступление, от 1 минуты. Жёсткого ограничения по давности нет, но платформа показывает поставщику рекомендацию загружать наиболее свежий контент</w:t>
             </w:r>
           </w:p>
         </w:tc>
@@ -9471,7 +9484,7 @@
                 <w:sz w:val="19"/>
                 <w:szCs w:val="19"/>
               </w:rPr>
-              <w:t xml:space="preserve">Дополнительный статус, присваивается автоматически по рейтингу и количеству сделок через платформу либо приобретается через платное продвижение (ТЗ, раздел 5)</w:t>
+              <w:t xml:space="preserve">Дополнительный статус, присваивается автоматически на основе комбинации трёх факторов: отзывы и оценки клиентов, количество оказанных через платформу услуг, время (стаж) пребывания на платформе. Не продаётся и не связан с платным продвижением (последнее — отдельный инструмент, ТЗ раздел 5) — только заслуженный рейтинг</w:t>
             </w:r>
           </w:p>
         </w:tc>
@@ -9670,17 +9683,20 @@
       </w:tr>
     </w:tbl>
     <w:p>
-      <w:r>
-        <w:br w:type="page"/>
+      <w:pPr>
+        <w:pStyle w:val="Heading2"/>
+        <w:spacing w:after="150" w:before="300"/>
+      </w:pPr>
+      <w:r>
+        <w:t xml:space="preserve">5.4. Критерии статуса «Топ поставщик»</w:t>
       </w:r>
     </w:p>
     <w:p>
       <w:pPr>
-        <w:pStyle w:val="Heading1"/>
-        <w:spacing w:after="200" w:before="400"/>
+        <w:spacing w:after="160"/>
       </w:pPr>
       <w:r>
-        <w:t xml:space="preserve">6. Открытые вопросы для дальнейшего уточнения</w:t>
+        <w:t xml:space="preserve">Статус рассчитывается платформой автоматически по совокупности трёх факторов — без возможности покупки или ручного назначения:</w:t>
       </w:r>
     </w:p>
     <w:p>
@@ -9693,7 +9709,7 @@
         <w:spacing w:after="80"/>
       </w:pPr>
       <w:r>
-        <w:t xml:space="preserve">Для всех ли «живых» категорий видео-референс обязателен без исключений, или для части из них (например, кондитеры) допустимо ограничиться фото?</w:t>
+        <w:t xml:space="preserve">Отзывы и оценки клиентов — средний рейтинг и количество отзывов, оставленных только по завершённым сделкам.</w:t>
       </w:r>
     </w:p>
     <w:p>
@@ -9706,7 +9722,7 @@
         <w:spacing w:after="80"/>
       </w:pPr>
       <w:r>
-        <w:t xml:space="preserve">Принимать ли видео-портфолио старше 2 лет, или ограничить давность жёстче/мягче?</w:t>
+        <w:t xml:space="preserve">Количество оказанных услуг — число успешно закрытых бронирований через платформу.</w:t>
       </w:r>
     </w:p>
     <w:p>
@@ -9719,7 +9735,42 @@
         <w:spacing w:after="80"/>
       </w:pPr>
       <w:r>
-        <w:t xml:space="preserve">Нужно ли заполнение карточки сразу на 3 языках (узб./рус./англ.) или на одном языке с последующим автопереводом для остальных?</w:t>
+        <w:t xml:space="preserve">Стаж на платформе — время, прошедшее с момента получения статуса «Проверено».</w:t>
+      </w:r>
+    </w:p>
+    <w:p>
+      <w:pPr>
+        <w:spacing w:after="160"/>
+      </w:pPr>
+      <w:r>
+        <w:rPr>
+          <w:i/>
+          <w:iCs/>
+          <w:color w:val="555555"/>
+        </w:rPr>
+        <w:t xml:space="preserve">Точные пороговые значения (например, минимальный рейтинг и минимальное число сделок) устанавливаются администратором перед запуском и калибруются по мере накопления статистики — это техническая настройка, а не предмет отдельного ТЗ.</w:t>
+      </w:r>
+    </w:p>
+    <w:p>
+      <w:r>
+        <w:br w:type="page"/>
+      </w:r>
+    </w:p>
+    <w:p>
+      <w:pPr>
+        <w:pStyle w:val="Heading1"/>
+        <w:spacing w:after="200" w:before="400"/>
+      </w:pPr>
+      <w:r>
+        <w:t xml:space="preserve">6. Журнал решений (обновление v1.1)</w:t>
+      </w:r>
+    </w:p>
+    <w:p>
+      <w:pPr>
+        <w:spacing w:after="160"/>
+      </w:pPr>
+      <w:r>
+        <w:t xml:space="preserve">Все вопросы, вынесенные как открытые в версии 1.0, были рассмотрены и закрыты. Решения уже внесены в соответствующие разделы выше; ниже — сводка для истории версии.</w:t>
       </w:r>
     </w:p>
     <w:p>
@@ -9732,7 +9783,7 @@
         <w:spacing w:after="80"/>
       </w:pPr>
       <w:r>
-        <w:t xml:space="preserve">Сколько дополнительных категорий разрешить одному поставщику бесплатно, и должна ли каждая следующая быть платной опцией (связь с моделью монетизации, ТЗ раздел 5)?</w:t>
+        <w:t xml:space="preserve">Видео-референс обязателен только для категорий с «живым исполнением» (артисты, ведущие, музыканты, танцоры, аниматоры, шоу-программы). Для декораторов, флористов, кондитеров и прочих визуальных категорий достаточно фото — см. раздел 4.4.</w:t>
       </w:r>
     </w:p>
     <w:p>
@@ -9745,7 +9796,46 @@
         <w:spacing w:after="80"/>
       </w:pPr>
       <w:r>
-        <w:t xml:space="preserve">Нужен ли отдельный ускоренный уровень верификации («Топ поставщик») с ручным собеседованием/выездной проверкой для премиальных площадок и агентств полного цикла?</w:t>
+        <w:t xml:space="preserve">Жёсткого ограничения по давности видео-портфолио нет; платформа рекомендует поставщику загружать наиболее свежий контент — см. раздел 4.4.</w:t>
+      </w:r>
+    </w:p>
+    <w:p>
+      <w:pPr>
+        <w:pStyle w:val="ListParagraph"/>
+        <w:numPr>
+          <w:ilvl w:val="0"/>
+          <w:numId w:val="1"/>
+        </w:numPr>
+        <w:spacing w:after="80"/>
+      </w:pPr>
+      <w:r>
+        <w:t xml:space="preserve">На старте платформа и карточки поставщиков заполняются на двух языках — узбекском и русском; английский добавляется позже — см. раздел 4.1.</w:t>
+      </w:r>
+    </w:p>
+    <w:p>
+      <w:pPr>
+        <w:pStyle w:val="ListParagraph"/>
+        <w:numPr>
+          <w:ilvl w:val="0"/>
+          <w:numId w:val="1"/>
+        </w:numPr>
+        <w:spacing w:after="80"/>
+      </w:pPr>
+      <w:r>
+        <w:t xml:space="preserve">Размещение во всех категориях (основной и дополнительных) бесплатное — см. раздел 4.1.</w:t>
+      </w:r>
+    </w:p>
+    <w:p>
+      <w:pPr>
+        <w:pStyle w:val="ListParagraph"/>
+        <w:numPr>
+          <w:ilvl w:val="0"/>
+          <w:numId w:val="1"/>
+        </w:numPr>
+        <w:spacing w:after="80"/>
+      </w:pPr>
+      <w:r>
+        <w:t xml:space="preserve">Статус «Топ поставщик» нужен и рассчитывается автоматически по отзывам/оценкам, количеству оказанных услуг и стажу на платформе — см. раздел 5.4.</w:t>
       </w:r>
     </w:p>
     <w:sectPr>

</xml_diff>